<commit_message>
Docs v3.0: intro, requirements analysis and SRS updated to the current app
F1 Analytics Hub instead of Ferrari & Leclerc Hub; FR-01..FR-26, NFR-01..NFR-14,
traceability to real tests, AT-01..AT-20 incl. CI launch checks on four platforms,
new architecture and data model (schema v4, 12 tables) figures. Formatting kept.

Co-Authored-By: Claude Opus 5.5 <noreply@anthropic.com>
</commit_message>
<xml_diff>
--- a/docs/Введение_в_проект.docx
+++ b/docs/Введение_в_проект.docx
@@ -58,7 +58,7 @@
           <w:sz w:val="26"/>
           <w:szCs w:val="26"/>
         </w:rPr>
-        <w:t xml:space="preserve">Проект: Ferrari &amp; Leclerc Hub</w:t>
+        <w:t>Проект: F1 Analytics Hub</w:t>
       </w:r>
     </w:p>
     <w:p>
@@ -75,7 +75,7 @@
           <w:sz w:val="22"/>
           <w:szCs w:val="22"/>
         </w:rPr>
-        <w:t xml:space="preserve">Версия 2.0 · 20 октября 2026 г.</w:t>
+        <w:t>Версия 3.0 · 29 октября 2026 г.</w:t>
       </w:r>
     </w:p>
     <w:p>
@@ -84,6 +84,7 @@
         <w:keepNext/>
       </w:pPr>
       <w:r>
+        <w:rPr/>
         <w:t xml:space="preserve">1. Название проекта</w:t>
       </w:r>
     </w:p>
@@ -93,7 +94,8 @@
         <w:jc w:val="both"/>
       </w:pPr>
       <w:r>
-        <w:t xml:space="preserve">Ferrari &amp; Leclerc Hub — кроссплатформенное приложение для просмотра статистики Формулы-1 с акцентом на пилота Шарля Леклера и команду Scuderia Ferrari.</w:t>
+        <w:rPr/>
+        <w:t xml:space="preserve">F1 Analytics Hub — кроссплатформенное приложение для просмотра статистики Формулы-1: чемпионат, календарь, пилоты и команды, Live Timing во время сессий, разбор гонок и история чемпионата с 1950 года. До третьей итерации проект назывался Ferrari &amp; Leclerc Hub и был посвящён одному пилоту; теперь все пилоты и команды равноправны.</w:t>
       </w:r>
     </w:p>
     <w:p>
@@ -102,6 +104,7 @@
         <w:keepNext/>
       </w:pPr>
       <w:r>
+        <w:rPr/>
         <w:t xml:space="preserve">2. Описание проекта</w:t>
       </w:r>
     </w:p>
@@ -111,7 +114,8 @@
         <w:jc w:val="both"/>
       </w:pPr>
       <w:r>
-        <w:t xml:space="preserve">Проект представляет собой настольное и мобильное приложение, разработанное на языке Python с использованием фреймворка Flet. Приложение показывает актуальные данные чемпионата Формулы-1: личный и командный зачёт, календарь сезона с расписанием сессий, результаты Шарля Леклера по гонкам и сравнение пилотов.</w:t>
+        <w:rPr/>
+        <w:t xml:space="preserve">Приложение разработано на языке Python 3.11 с использованием фреймворка Flet 1.0 и из одного кода работает на Windows, macOS, Android и iPhone. Оно показывает актуальные данные чемпионата Формулы-1, а во время тренировок, квалификаций и гонок — живую таблицу с отрывами, шинами, секторами, флагами и радио команд.</w:t>
       </w:r>
     </w:p>
     <w:p>
@@ -120,17 +124,18 @@
         <w:jc w:val="both"/>
       </w:pPr>
       <w:r>
-        <w:t xml:space="preserve">Данные загружаются из открытого API Jolpica (преемник Ergast F1 API) и сохраняются в локальной базе данных SQLite. Благодаря этому приложение открывается мгновенно и остаётся полезным без интернета: пользователь видит последнюю сохранённую копию с указанием времени обновления, а при появлении сети данные обновляются в фоне автоматически. Вымышленных «запасных» данных в приложении нет — на экране всегда либо данные API, либо их сохранённая копия, либо понятное сообщение о том, что данных пока нет.</w:t>
-      </w:r>
-    </w:p>
-    <w:p>
-      <w:pPr>
-        <w:keepNext/>
+        <w:rPr/>
+        <w:t xml:space="preserve">Все источники данных бесплатны и не требуют ключей доступа. Данные чемпионата, календарь, результаты и история загружаются из открытого API Jolpica (преемник Ergast F1 API); живые данные сессии — из официального потока F1 live timing; OpenF1 служит запасным источником и источником данных прошедших сессий; контуры трасс берутся из MultiViewer. Данные сохраняются в локальной базе SQLite, поэтому приложение открывается мгновенно и остаётся полезным без интернета. Вымышленных данных в приложении нет: на экране всегда либо данные источника, либо их сохранённая копия с датой обновления, либо понятное сообщение о том, что данных пока нет.</w:t>
+      </w:r>
+    </w:p>
+    <w:p>
+      <w:pPr>
         <w:spacing w:after="120" w:before="0" w:line="300"/>
         <w:jc w:val="both"/>
       </w:pPr>
       <w:r>
-        <w:t xml:space="preserve">Интерфейс выполнен в фирменных цветах Ferrari (красный, жёлтый, чёрный), использует тёмную тему и русский язык. Основные разделы приложения:</w:t>
+        <w:rPr/>
+        <w:t xml:space="preserve">Интерфейс выполнен в фирменной стилистике Формулы-1 (карбоновый фон, полоса цвета команды у каждого пилота; красный — только для LIVE, стартовых огней и главных действий) и полностью на русском языке. Есть четыре темы (тёмная, OLED, светлая, в цветах любимой команды), три размера шрифта и режим «Меньше движения». Основные разделы приложения:</w:t>
       </w:r>
     </w:p>
     <w:p>
@@ -146,12 +151,12 @@
       <w:r>
         <w:rPr>
           <w:b/>
-          <w:bCs/>
         </w:rPr>
         <w:t xml:space="preserve">Главная</w:t>
       </w:r>
       <w:r>
-        <w:t xml:space="preserve"> — позиция, очки и победы Леклера; отрыв от соседей по зачёту; ближайшая гонка с обратным отсчётом и расписанием сессий; избранные пилоты;</w:t>
+        <w:rPr/>
+        <w:t xml:space="preserve"> — стартовые огни до гонки, ближайший этап с трассой и обратным отсчётом, Live Timing во время сессии, подиум последней гонки, любимые пилоты; блоки можно включать и переставлять;</w:t>
       </w:r>
     </w:p>
     <w:p>
@@ -167,12 +172,12 @@
       <w:r>
         <w:rPr>
           <w:b/>
-          <w:bCs/>
         </w:rPr>
         <w:t xml:space="preserve">Чемпионат</w:t>
       </w:r>
       <w:r>
-        <w:t xml:space="preserve"> — личный зачёт пилотов, Кубок конструкторов и список избранных пилотов;</w:t>
+        <w:rPr/>
+        <w:t xml:space="preserve"> — личный зачёт, Кубок конструкторов, избранные пилоты, тепловая карта сезона;</w:t>
       </w:r>
     </w:p>
     <w:p>
@@ -188,12 +193,12 @@
       <w:r>
         <w:rPr>
           <w:b/>
-          <w:bCs/>
         </w:rPr>
         <w:t xml:space="preserve">Календарь</w:t>
       </w:r>
       <w:r>
-        <w:t xml:space="preserve"> — предстоящие и прошедшие этапы сезона, расписание уик-энда в местном времени пользователя;</w:t>
+        <w:rPr/>
+        <w:t xml:space="preserve"> — предстоящие и прошедшие этапы, расписание уик-энда в местном времени, страница трассы;</w:t>
       </w:r>
     </w:p>
     <w:p>
@@ -209,12 +214,12 @@
       <w:r>
         <w:rPr>
           <w:b/>
-          <w:bCs/>
-        </w:rPr>
-        <w:t xml:space="preserve">Леклер</w:t>
-      </w:r>
-      <w:r>
-        <w:t xml:space="preserve"> — подиумы, лучший финиш, сходы, график очков по гонкам и список результатов;</w:t>
+        </w:rPr>
+        <w:t xml:space="preserve">Пилоты</w:t>
+      </w:r>
+      <w:r>
+        <w:rPr/>
+        <w:t xml:space="preserve"> — все пилоты сезона с поиском и фильтром, страница любого пилота и команды;</w:t>
       </w:r>
     </w:p>
     <w:p>
@@ -230,12 +235,12 @@
       <w:r>
         <w:rPr>
           <w:b/>
-          <w:bCs/>
         </w:rPr>
         <w:t xml:space="preserve">Ещё</w:t>
       </w:r>
       <w:r>
-        <w:t xml:space="preserve"> — «Дуэль» (сравнение Леклера с любым пилотом), «Стратегия» (план пит-стопов и шины по трассам) и «Настройки» (интервал автообновления, ручное обновление, очистка локальных данных).</w:t>
+        <w:rPr/>
+        <w:t xml:space="preserve"> — сравнение 2–4 пилотов, Live Timing, борьба за титул, прогнозы, история сезонов, избранное, стратегия, настройки и (на компьютере) мини-виджет.</w:t>
       </w:r>
     </w:p>
     <w:p>
@@ -244,7 +249,8 @@
         <w:jc w:val="both"/>
       </w:pPr>
       <w:r>
-        <w:t xml:space="preserve">Приложение собирается в исполняемый файл (.exe) для Windows; сборка под Android рассматривается как необязательная. Для разработки и тестирования используется настольный и веб-режим Flet.</w:t>
+        <w:rPr/>
+        <w:t xml:space="preserve">Приложение собирается для Windows (.exe), macOS (.app), Android (.apk) и iPhone. Сборки выполняются в GitHub Actions, и каждая из них проверяется запуском: на Windows и macOS — запуском собранного файла, на Android — на эмуляторе, на iPhone — на симуляторе.</w:t>
       </w:r>
     </w:p>
     <w:p>
@@ -253,6 +259,7 @@
         <w:keepNext/>
       </w:pPr>
       <w:r>
+        <w:rPr/>
         <w:t xml:space="preserve">3. Целевая аудитория проекта</w:t>
       </w:r>
     </w:p>
@@ -262,7 +269,8 @@
         <w:jc w:val="both"/>
       </w:pPr>
       <w:r>
-        <w:t xml:space="preserve">Основная целевая аудитория — болельщики Формулы-1, в первую очередь фанаты команды Ferrari и пилота Шарля Леклера. Приложение ориентировано на пользователей, которым удобно быстро просматривать актуальные результаты чемпионата без необходимости открывать официальный сайт или сторонние спортивные сервисы.</w:t>
+        <w:rPr/>
+        <w:t xml:space="preserve">Основная целевая аудитория — болельщики Формулы-1 независимо от любимого пилота и команды. Приложение рассчитано на тех, кто смотрит гонки и хочет держать под рукой живую таблицу и положение в чемпионате на телефоне или компьютере, не открывая официальный сайт и сторонние спортивные сервисы.</w:t>
       </w:r>
     </w:p>
     <w:p>
@@ -271,7 +279,18 @@
         <w:jc w:val="both"/>
       </w:pPr>
       <w:r>
-        <w:t xml:space="preserve">Вторичная аудитория — студенты IT-специальностей, изучающие разработку кроссплатформенных приложений на Python, а также преподаватели, оценивающие учебный проект. Приложение демонстрирует работу с REST API, локальной базой данных, фоновыми потоками, построение интерфейса на Flet, автоматическое тестирование и упаковку готового продукта.</w:t>
+        <w:rPr/>
+        <w:t xml:space="preserve">Отдельно учтены пользователи с особыми потребностями: крупный шрифт, контраст текста не ниже 4,5:1 во всех темах, подписи для экранного диктора и режим «Меньше движения» для чувствительных к анимации.</w:t>
+      </w:r>
+    </w:p>
+    <w:p>
+      <w:pPr>
+        <w:spacing w:after="120" w:before="0" w:line="300"/>
+        <w:jc w:val="both"/>
+      </w:pPr>
+      <w:r>
+        <w:rPr/>
+        <w:t xml:space="preserve">Вторичная аудитория — студенты IT-специальностей, изучающие разработку кроссплатформенных приложений на Python, и преподаватели, оценивающие учебный проект. Приложение демонстрирует работу с REST API и потоком WebSocket, локальной базой данных, фоновыми потоками, дизайн-системой, автоматическим тестированием и сборкой под четыре платформы.</w:t>
       </w:r>
     </w:p>
     <w:p>
@@ -280,6 +299,7 @@
         <w:keepNext/>
       </w:pPr>
       <w:r>
+        <w:rPr/>
         <w:t xml:space="preserve">4. Срок выполнения проекта</w:t>
       </w:r>
     </w:p>
@@ -289,17 +309,18 @@
         <w:jc w:val="both"/>
       </w:pPr>
       <w:r>
-        <w:t xml:space="preserve">Общий срок разработки проекта составляет 1,5 месяца. В этот период входят: постановка задачи и подготовка документации, проектирование интерфейса, реализация основных функций, подключение API, тестирование и сборка исполняемого файла.</w:t>
-      </w:r>
-    </w:p>
-    <w:p>
-      <w:pPr>
-        <w:keepNext/>
+        <w:rPr/>
+        <w:t xml:space="preserve">Общий срок разработки проекта составляет 1,5 месяца. В этот период входят: постановка задачи и подготовка документации, проектирование интерфейса, реализация основных функций, подключение источников данных, тестирование и сборка приложения.</w:t>
+      </w:r>
+    </w:p>
+    <w:p>
+      <w:pPr>
         <w:spacing w:after="120" w:before="0" w:line="300"/>
         <w:jc w:val="both"/>
       </w:pPr>
       <w:r>
-        <w:t xml:space="preserve">Ключевые этапы и их состояние на 20 октября 2026 г.:</w:t>
+        <w:rPr/>
+        <w:t xml:space="preserve">Ключевые этапы и их состояние на 29 октября 2026 г.:</w:t>
       </w:r>
     </w:p>
     <w:tbl>
@@ -315,10 +336,10 @@
         </w:tblBorders>
       </w:tblPr>
       <w:tblGrid>
-        <w:gridCol w:w="400"/>
-        <w:gridCol w:w="3955"/>
-        <w:gridCol w:w="2000"/>
-        <w:gridCol w:w="3000"/>
+        <w:gridCol w:w="468"/>
+        <w:gridCol w:w="2806"/>
+        <w:gridCol w:w="1871"/>
+        <w:gridCol w:w="4210"/>
       </w:tblGrid>
       <w:tr>
         <w:trPr>
@@ -327,7 +348,7 @@
         </w:trPr>
         <w:tc>
           <w:tcPr>
-            <w:tcW w:type="dxa" w:w="400"/>
+            <w:tcW w:type="dxa" w:w="468"/>
             <w:tcBorders>
               <w:top w:val="single" w:color="A6A6A6" w:sz="4"/>
               <w:left w:val="single" w:color="A6A6A6" w:sz="4"/>
@@ -349,8 +370,6 @@
             </w:pPr>
             <w:r>
               <w:rPr>
-                <w:b/>
-                <w:bCs/>
                 <w:sz w:val="20"/>
                 <w:szCs w:val="20"/>
               </w:rPr>
@@ -360,7 +379,7 @@
         </w:tc>
         <w:tc>
           <w:tcPr>
-            <w:tcW w:type="dxa" w:w="3955"/>
+            <w:tcW w:type="dxa" w:w="2806"/>
             <w:tcBorders>
               <w:top w:val="single" w:color="A6A6A6" w:sz="4"/>
               <w:left w:val="single" w:color="A6A6A6" w:sz="4"/>
@@ -382,8 +401,6 @@
             </w:pPr>
             <w:r>
               <w:rPr>
-                <w:b/>
-                <w:bCs/>
                 <w:sz w:val="20"/>
                 <w:szCs w:val="20"/>
               </w:rPr>
@@ -393,7 +410,7 @@
         </w:tc>
         <w:tc>
           <w:tcPr>
-            <w:tcW w:type="dxa" w:w="2000"/>
+            <w:tcW w:type="dxa" w:w="1871"/>
             <w:tcBorders>
               <w:top w:val="single" w:color="A6A6A6" w:sz="4"/>
               <w:left w:val="single" w:color="A6A6A6" w:sz="4"/>
@@ -415,8 +432,6 @@
             </w:pPr>
             <w:r>
               <w:rPr>
-                <w:b/>
-                <w:bCs/>
                 <w:sz w:val="20"/>
                 <w:szCs w:val="20"/>
               </w:rPr>
@@ -426,7 +441,7 @@
         </w:tc>
         <w:tc>
           <w:tcPr>
-            <w:tcW w:type="dxa" w:w="3000"/>
+            <w:tcW w:type="dxa" w:w="4210"/>
             <w:tcBorders>
               <w:top w:val="single" w:color="A6A6A6" w:sz="4"/>
               <w:left w:val="single" w:color="A6A6A6" w:sz="4"/>
@@ -448,8 +463,6 @@
             </w:pPr>
             <w:r>
               <w:rPr>
-                <w:b/>
-                <w:bCs/>
                 <w:sz w:val="20"/>
                 <w:szCs w:val="20"/>
               </w:rPr>
@@ -464,7 +477,7 @@
         </w:trPr>
         <w:tc>
           <w:tcPr>
-            <w:tcW w:type="dxa" w:w="400"/>
+            <w:tcW w:type="dxa" w:w="468"/>
             <w:tcBorders>
               <w:top w:val="single" w:color="A6A6A6" w:sz="4"/>
               <w:left w:val="single" w:color="A6A6A6" w:sz="4"/>
@@ -494,7 +507,7 @@
         </w:tc>
         <w:tc>
           <w:tcPr>
-            <w:tcW w:type="dxa" w:w="3955"/>
+            <w:tcW w:type="dxa" w:w="2806"/>
             <w:tcBorders>
               <w:top w:val="single" w:color="A6A6A6" w:sz="4"/>
               <w:left w:val="single" w:color="A6A6A6" w:sz="4"/>
@@ -524,7 +537,7 @@
         </w:tc>
         <w:tc>
           <w:tcPr>
-            <w:tcW w:type="dxa" w:w="2000"/>
+            <w:tcW w:type="dxa" w:w="1871"/>
             <w:tcBorders>
               <w:top w:val="single" w:color="A6A6A6" w:sz="4"/>
               <w:left w:val="single" w:color="A6A6A6" w:sz="4"/>
@@ -554,7 +567,7 @@
         </w:tc>
         <w:tc>
           <w:tcPr>
-            <w:tcW w:type="dxa" w:w="3000"/>
+            <w:tcW w:type="dxa" w:w="4210"/>
             <w:tcBorders>
               <w:top w:val="single" w:color="A6A6A6" w:sz="4"/>
               <w:left w:val="single" w:color="A6A6A6" w:sz="4"/>
@@ -578,7 +591,7 @@
                 <w:sz w:val="20"/>
                 <w:szCs w:val="20"/>
               </w:rPr>
-              <w:t xml:space="preserve">Выполнен; документ обновлён (версия 2.0)</w:t>
+              <w:t xml:space="preserve">Выполнен; документ обновлён (версия 3.0)</w:t>
             </w:r>
           </w:p>
         </w:tc>
@@ -589,7 +602,7 @@
         </w:trPr>
         <w:tc>
           <w:tcPr>
-            <w:tcW w:type="dxa" w:w="400"/>
+            <w:tcW w:type="dxa" w:w="468"/>
             <w:tcBorders>
               <w:top w:val="single" w:color="A6A6A6" w:sz="4"/>
               <w:left w:val="single" w:color="A6A6A6" w:sz="4"/>
@@ -619,7 +632,7 @@
         </w:tc>
         <w:tc>
           <w:tcPr>
-            <w:tcW w:type="dxa" w:w="3955"/>
+            <w:tcW w:type="dxa" w:w="2806"/>
             <w:tcBorders>
               <w:top w:val="single" w:color="A6A6A6" w:sz="4"/>
               <w:left w:val="single" w:color="A6A6A6" w:sz="4"/>
@@ -649,7 +662,7 @@
         </w:tc>
         <w:tc>
           <w:tcPr>
-            <w:tcW w:type="dxa" w:w="2000"/>
+            <w:tcW w:type="dxa" w:w="1871"/>
             <w:tcBorders>
               <w:top w:val="single" w:color="A6A6A6" w:sz="4"/>
               <w:left w:val="single" w:color="A6A6A6" w:sz="4"/>
@@ -679,7 +692,7 @@
         </w:tc>
         <w:tc>
           <w:tcPr>
-            <w:tcW w:type="dxa" w:w="3000"/>
+            <w:tcW w:type="dxa" w:w="4210"/>
             <w:tcBorders>
               <w:top w:val="single" w:color="A6A6A6" w:sz="4"/>
               <w:left w:val="single" w:color="A6A6A6" w:sz="4"/>
@@ -703,7 +716,7 @@
                 <w:sz w:val="20"/>
                 <w:szCs w:val="20"/>
               </w:rPr>
-              <w:t xml:space="preserve">Выполнен; документ обновлён (версия 2.0)</w:t>
+              <w:t xml:space="preserve">Выполнен; документ обновлён (версия 3.0)</w:t>
             </w:r>
           </w:p>
         </w:tc>
@@ -714,7 +727,7 @@
         </w:trPr>
         <w:tc>
           <w:tcPr>
-            <w:tcW w:type="dxa" w:w="400"/>
+            <w:tcW w:type="dxa" w:w="468"/>
             <w:tcBorders>
               <w:top w:val="single" w:color="A6A6A6" w:sz="4"/>
               <w:left w:val="single" w:color="A6A6A6" w:sz="4"/>
@@ -744,7 +757,7 @@
         </w:tc>
         <w:tc>
           <w:tcPr>
-            <w:tcW w:type="dxa" w:w="3955"/>
+            <w:tcW w:type="dxa" w:w="2806"/>
             <w:tcBorders>
               <w:top w:val="single" w:color="A6A6A6" w:sz="4"/>
               <w:left w:val="single" w:color="A6A6A6" w:sz="4"/>
@@ -768,13 +781,13 @@
                 <w:sz w:val="20"/>
                 <w:szCs w:val="20"/>
               </w:rPr>
-              <w:t xml:space="preserve">Реализация основных экранов и API</w:t>
+              <w:t xml:space="preserve">Реализация основных экранов и источников данных</w:t>
             </w:r>
           </w:p>
         </w:tc>
         <w:tc>
           <w:tcPr>
-            <w:tcW w:type="dxa" w:w="2000"/>
+            <w:tcW w:type="dxa" w:w="1871"/>
             <w:tcBorders>
               <w:top w:val="single" w:color="A6A6A6" w:sz="4"/>
               <w:left w:val="single" w:color="A6A6A6" w:sz="4"/>
@@ -804,7 +817,7 @@
         </w:tc>
         <w:tc>
           <w:tcPr>
-            <w:tcW w:type="dxa" w:w="3000"/>
+            <w:tcW w:type="dxa" w:w="4210"/>
             <w:tcBorders>
               <w:top w:val="single" w:color="A6A6A6" w:sz="4"/>
               <w:left w:val="single" w:color="A6A6A6" w:sz="4"/>
@@ -828,7 +841,7 @@
                 <w:sz w:val="20"/>
                 <w:szCs w:val="20"/>
               </w:rPr>
-              <w:t xml:space="preserve">Выполнен и расширен: локальная БД, календарь, Кубок конструкторов, график очков, избранное, настройки. Автотесты проходят</w:t>
+              <w:t xml:space="preserve">Выполнен и расширен: 25 экранов, Live Timing, радио команд, история, прогнозы, уведомления и виджеты. Все 148 автотестов проходят</w:t>
             </w:r>
           </w:p>
         </w:tc>
@@ -839,7 +852,7 @@
         </w:trPr>
         <w:tc>
           <w:tcPr>
-            <w:tcW w:type="dxa" w:w="400"/>
+            <w:tcW w:type="dxa" w:w="468"/>
             <w:tcBorders>
               <w:top w:val="single" w:color="A6A6A6" w:sz="4"/>
               <w:left w:val="single" w:color="A6A6A6" w:sz="4"/>
@@ -869,7 +882,7 @@
         </w:tc>
         <w:tc>
           <w:tcPr>
-            <w:tcW w:type="dxa" w:w="3955"/>
+            <w:tcW w:type="dxa" w:w="2806"/>
             <w:tcBorders>
               <w:top w:val="single" w:color="A6A6A6" w:sz="4"/>
               <w:left w:val="single" w:color="A6A6A6" w:sz="4"/>
@@ -893,13 +906,13 @@
                 <w:sz w:val="20"/>
                 <w:szCs w:val="20"/>
               </w:rPr>
-              <w:t xml:space="preserve">Финальная сборка .exe и подготовка отчётных материалов</w:t>
+              <w:t xml:space="preserve">Сборка под все платформы и подготовка отчётных материалов</w:t>
             </w:r>
           </w:p>
         </w:tc>
         <w:tc>
           <w:tcPr>
-            <w:tcW w:type="dxa" w:w="2000"/>
+            <w:tcW w:type="dxa" w:w="1871"/>
             <w:tcBorders>
               <w:top w:val="single" w:color="A6A6A6" w:sz="4"/>
               <w:left w:val="single" w:color="A6A6A6" w:sz="4"/>
@@ -923,13 +936,13 @@
                 <w:sz w:val="20"/>
                 <w:szCs w:val="20"/>
               </w:rPr>
-              <w:t xml:space="preserve">до завершения учебного срока</w:t>
+              <w:t xml:space="preserve">до 29 октября 2026 г.</w:t>
             </w:r>
           </w:p>
         </w:tc>
         <w:tc>
           <w:tcPr>
-            <w:tcW w:type="dxa" w:w="3000"/>
+            <w:tcW w:type="dxa" w:w="4210"/>
             <w:tcBorders>
               <w:top w:val="single" w:color="A6A6A6" w:sz="4"/>
               <w:left w:val="single" w:color="A6A6A6" w:sz="4"/>
@@ -953,7 +966,7 @@
                 <w:sz w:val="20"/>
                 <w:szCs w:val="20"/>
               </w:rPr>
-              <w:t xml:space="preserve">В работе: подготовлены скрипт сборки и инструкция; проверка сборки и запуска на Windows 10/11 предстоит</w:t>
+              <w:t xml:space="preserve">Выполнен: сборки Windows, macOS, Android и iPhone собираются и проверяются запуском в GitHub Actions; подготовлены материалы для магазинов приложений</w:t>
             </w:r>
           </w:p>
         </w:tc>
@@ -961,15 +974,11 @@
     </w:tbl>
     <w:p>
       <w:pPr>
-        <w:spacing w:after="120"/>
-      </w:pPr>
-    </w:p>
-    <w:p>
-      <w:pPr>
         <w:pStyle w:val="Heading1"/>
         <w:keepNext/>
       </w:pPr>
       <w:r>
+        <w:rPr/>
         <w:t xml:space="preserve">5. Что изменилось во второй итерации</w:t>
       </w:r>
     </w:p>
@@ -1107,6 +1116,173 @@
       </w:r>
       <w:r>
         <w:t xml:space="preserve"> журнал работы, 42 автоматических теста, начальный снимок данных для первого запуска без интернета, скрипт сборки .exe.</w:t>
+      </w:r>
+    </w:p>
+    <w:p>
+      <w:pPr>
+        <w:pStyle w:val="Heading1"/>
+        <w:keepNext/>
+      </w:pPr>
+      <w:r>
+        <w:rPr/>
+        <w:t xml:space="preserve">6. Что изменилось в третьей итерации</w:t>
+      </w:r>
+    </w:p>
+    <w:p>
+      <w:pPr>
+        <w:spacing w:after="120" w:before="0" w:line="300"/>
+        <w:jc w:val="both"/>
+      </w:pPr>
+      <w:r>
+        <w:rPr/>
+        <w:t xml:space="preserve">Третья итерация превратила приложение одного пилота в приложение для всех болельщиков и вывела его на телефоны. Основные изменения:</w:t>
+      </w:r>
+    </w:p>
+    <w:p>
+      <w:pPr>
+        <w:pStyle w:val="ListParagraph"/>
+        <w:numPr>
+          <w:ilvl w:val="0"/>
+          <w:numId w:val="4"/>
+        </w:numPr>
+        <w:spacing w:after="60" w:line="300"/>
+        <w:jc w:val="both"/>
+      </w:pPr>
+      <w:r>
+        <w:rPr>
+          <w:b/>
+        </w:rPr>
+        <w:t xml:space="preserve">Все пилоты вместо одного.</w:t>
+      </w:r>
+      <w:r>
+        <w:rPr/>
+        <w:t xml:space="preserve"> Приложение переименовано в F1 Analytics Hub. Раздел «Леклер» заменён разделом «Пилоты» со страницей любого пилота и команды, «Дуэль» — сравнением 2–4 любых пилотов.</w:t>
+      </w:r>
+    </w:p>
+    <w:p>
+      <w:pPr>
+        <w:pStyle w:val="ListParagraph"/>
+        <w:numPr>
+          <w:ilvl w:val="0"/>
+          <w:numId w:val="4"/>
+        </w:numPr>
+        <w:spacing w:after="60" w:line="300"/>
+        <w:jc w:val="both"/>
+      </w:pPr>
+      <w:r>
+        <w:rPr>
+          <w:b/>
+        </w:rPr>
+        <w:t xml:space="preserve">Live Timing.</w:t>
+      </w:r>
+      <w:r>
+        <w:rPr/>
+        <w:t xml:space="preserve"> Во время сессии — живая таблица из официального потока F1: позиции, отрывы, шины, секторы, флаги и сейфти-кар, погода, трасса с точками пилотов и радио в прямом эфире.</w:t>
+      </w:r>
+    </w:p>
+    <w:p>
+      <w:pPr>
+        <w:pStyle w:val="ListParagraph"/>
+        <w:numPr>
+          <w:ilvl w:val="0"/>
+          <w:numId w:val="4"/>
+        </w:numPr>
+        <w:spacing w:after="60" w:line="300"/>
+        <w:jc w:val="both"/>
+      </w:pPr>
+      <w:r>
+        <w:rPr>
+          <w:b/>
+        </w:rPr>
+        <w:t xml:space="preserve">Новые разделы:</w:t>
+      </w:r>
+      <w:r>
+        <w:rPr/>
+        <w:t xml:space="preserve"> история сезонов с 1950 года, борьба за титул, прогнозы на поул и подиум, тепловая карта сезона, разбор гонки (позиции и темп по кругам, стратегия шин), радио команд с переводом на русский прямо на устройстве.</w:t>
+      </w:r>
+    </w:p>
+    <w:p>
+      <w:pPr>
+        <w:pStyle w:val="ListParagraph"/>
+        <w:numPr>
+          <w:ilvl w:val="0"/>
+          <w:numId w:val="4"/>
+        </w:numPr>
+        <w:spacing w:after="60" w:line="300"/>
+        <w:jc w:val="both"/>
+      </w:pPr>
+      <w:r>
+        <w:rPr>
+          <w:b/>
+        </w:rPr>
+        <w:t xml:space="preserve">Четыре платформы:</w:t>
+      </w:r>
+      <w:r>
+        <w:rPr/>
+        <w:t xml:space="preserve"> Windows, macOS, Android и iPhone; виджет на главный экран Android, мини-виджет на компьютере, напоминания о сессиях.</w:t>
+      </w:r>
+    </w:p>
+    <w:p>
+      <w:pPr>
+        <w:pStyle w:val="ListParagraph"/>
+        <w:numPr>
+          <w:ilvl w:val="0"/>
+          <w:numId w:val="4"/>
+        </w:numPr>
+        <w:spacing w:after="60" w:line="300"/>
+        <w:jc w:val="both"/>
+      </w:pPr>
+      <w:r>
+        <w:rPr>
+          <w:b/>
+        </w:rPr>
+        <w:t xml:space="preserve">Дизайн и доступность:</w:t>
+      </w:r>
+      <w:r>
+        <w:rPr/>
+        <w:t xml:space="preserve"> дизайн-система с токенами, четыре темы, три размера шрифта, «Меньше движения», зоны нажатия не меньше 48 dp, подписи для экранного диктора; контраст проверяется автотестами во всех темах.</w:t>
+      </w:r>
+    </w:p>
+    <w:p>
+      <w:pPr>
+        <w:pStyle w:val="ListParagraph"/>
+        <w:numPr>
+          <w:ilvl w:val="0"/>
+          <w:numId w:val="4"/>
+        </w:numPr>
+        <w:spacing w:after="60" w:line="300"/>
+        <w:jc w:val="both"/>
+      </w:pPr>
+      <w:r>
+        <w:rPr>
+          <w:b/>
+        </w:rPr>
+        <w:t xml:space="preserve">Надёжность:</w:t>
+      </w:r>
+      <w:r>
+        <w:rPr/>
+        <w:t xml:space="preserve"> повреждённая база откладывается в сторону и создаётся заново; страница входа в Wi-Fi больше не может подменить фото пилотов; архив модели перевода не может записать файлы вне своей папки; ошибка в обработчике нажатия не закрывает приложение.</w:t>
+      </w:r>
+    </w:p>
+    <w:p>
+      <w:pPr>
+        <w:pStyle w:val="ListParagraph"/>
+        <w:numPr>
+          <w:ilvl w:val="0"/>
+          <w:numId w:val="4"/>
+        </w:numPr>
+        <w:spacing w:after="60" w:line="300"/>
+        <w:jc w:val="both"/>
+      </w:pPr>
+      <w:r>
+        <w:rPr>
+          <w:b/>
+        </w:rPr>
+        <w:t xml:space="preserve">Качество:</w:t>
+      </w:r>
+      <w:r>
+        <w:rPr/>
+        <w:t xml:space="preserve"> 148 автоматических тестов (в том числе построение всех экранов настоящим Flet и фаззинг разбора данных), линтер ruff, сборка и проверка запуска на всех платформах в GitHub Actions.</w:t>
       </w:r>
     </w:p>
     <w:sectPr>
@@ -1666,6 +1842,12 @@
     </w:lvlOverride>
   </w:num>
   <w:num w:numId="3">
+    <w:abstractNumId w:val="3"/>
+    <w:lvlOverride w:ilvl="0">
+      <w:startOverride w:val="1"/>
+    </w:lvlOverride>
+  </w:num>
+  <w:num w:numId="4">
     <w:abstractNumId w:val="3"/>
     <w:lvlOverride w:ilvl="0">
       <w:startOverride w:val="1"/>

</xml_diff>